<commit_message>
fix: eliminar columna 'Cuenta para regularidad' (Manual_Presentismo_Secundario_2026.docx)
</commit_message>
<xml_diff>
--- a/public/manuales/Manual_Presentismo_Secundario_2026.docx
+++ b/public/manuales/Manual_Presentismo_Secundario_2026.docx
@@ -1931,7 +1931,6 @@
       <w:tblGrid>
         <w:gridCol w:w="2200"/>
         <w:gridCol w:w="4326"/>
-        <w:gridCol w:w="2500"/>
       </w:tblGrid>
       <w:tr>
         <w:trPr>
@@ -1999,37 +1998,6 @@
             </w:r>
           </w:p>
         </w:tc>
-        <w:tc>
-          <w:tcPr>
-            <w:tcW w:type="dxa" w:w="2500"/>
-            <w:tcBorders>
-              <w:top w:val="single" w:color="073244" w:sz="1"/>
-              <w:left w:val="single" w:color="073244" w:sz="1"/>
-              <w:bottom w:val="single" w:color="073244" w:sz="1"/>
-              <w:right w:val="single" w:color="073244" w:sz="1"/>
-            </w:tcBorders>
-            <w:shd w:fill="073244" w:color="auto" w:val="clear"/>
-            <w:tcMar>
-              <w:top w:type="dxa" w:w="80"/>
-              <w:left w:type="dxa" w:w="120"/>
-              <w:bottom w:type="dxa" w:w="80"/>
-              <w:right w:type="dxa" w:w="120"/>
-            </w:tcMar>
-          </w:tcPr>
-          <w:p>
-            <w:r>
-              <w:rPr>
-                <w:rFonts w:ascii="Archivo" w:cs="Archivo" w:eastAsia="Archivo" w:hAnsi="Archivo"/>
-                <w:b/>
-                <w:bCs/>
-                <w:color w:val="FFFFFF"/>
-                <w:sz w:val="18"/>
-                <w:szCs w:val="18"/>
-              </w:rPr>
-              <w:t xml:space="preserve">Cuenta para regularidad</w:t>
-            </w:r>
-          </w:p>
-        </w:tc>
       </w:tr>
       <w:tr>
         <w:tc>
@@ -2093,15 +2061,18 @@
             </w:r>
           </w:p>
         </w:tc>
-        <w:tc>
-          <w:tcPr>
-            <w:tcW w:type="dxa" w:w="2500"/>
-            <w:tcBorders>
-              <w:top w:val="single" w:color="CCCCCC" w:sz="1"/>
-              <w:left w:val="single" w:color="CCCCCC" w:sz="1"/>
-              <w:bottom w:val="single" w:color="CCCCCC" w:sz="1"/>
-              <w:right w:val="single" w:color="CCCCCC" w:sz="1"/>
-            </w:tcBorders>
+      </w:tr>
+      <w:tr>
+        <w:tc>
+          <w:tcPr>
+            <w:tcW w:type="dxa" w:w="2200"/>
+            <w:tcBorders>
+              <w:top w:val="single" w:color="CCCCCC" w:sz="1"/>
+              <w:left w:val="single" w:color="CCCCCC" w:sz="1"/>
+              <w:bottom w:val="single" w:color="CCCCCC" w:sz="1"/>
+              <w:right w:val="single" w:color="CCCCCC" w:sz="1"/>
+            </w:tcBorders>
+            <w:shd w:fill="FFECEC" w:color="auto" w:val="clear"/>
             <w:tcMar>
               <w:top w:type="dxa" w:w="80"/>
               <w:left w:type="dxa" w:w="120"/>
@@ -2119,7 +2090,37 @@
                 <w:sz w:val="18"/>
                 <w:szCs w:val="18"/>
               </w:rPr>
-              <w:t xml:space="preserve">No</w:t>
+              <w:t xml:space="preserve">Ausente</w:t>
+            </w:r>
+          </w:p>
+        </w:tc>
+        <w:tc>
+          <w:tcPr>
+            <w:tcW w:type="dxa" w:w="4326"/>
+            <w:tcBorders>
+              <w:top w:val="single" w:color="CCCCCC" w:sz="1"/>
+              <w:left w:val="single" w:color="CCCCCC" w:sz="1"/>
+              <w:bottom w:val="single" w:color="CCCCCC" w:sz="1"/>
+              <w:right w:val="single" w:color="CCCCCC" w:sz="1"/>
+            </w:tcBorders>
+            <w:tcMar>
+              <w:top w:type="dxa" w:w="80"/>
+              <w:left w:type="dxa" w:w="120"/>
+              <w:bottom w:type="dxa" w:w="80"/>
+              <w:right w:type="dxa" w:w="120"/>
+            </w:tcMar>
+          </w:tcPr>
+          <w:p>
+            <w:r>
+              <w:rPr>
+                <w:rFonts w:ascii="Archivo" w:cs="Archivo" w:eastAsia="Archivo" w:hAnsi="Archivo"/>
+                <w:b w:val="false"/>
+                <w:bCs w:val="false"/>
+                <w:color w:val="222222"/>
+                <w:sz w:val="18"/>
+                <w:szCs w:val="18"/>
+              </w:rPr>
+              <w:t xml:space="preserve">No asistió. Se computa como inasistencia si no se justifica.</w:t>
             </w:r>
           </w:p>
         </w:tc>
@@ -2134,7 +2135,7 @@
               <w:bottom w:val="single" w:color="CCCCCC" w:sz="1"/>
               <w:right w:val="single" w:color="CCCCCC" w:sz="1"/>
             </w:tcBorders>
-            <w:shd w:fill="FFECEC" w:color="auto" w:val="clear"/>
+            <w:shd w:fill="FFF3E0" w:color="auto" w:val="clear"/>
             <w:tcMar>
               <w:top w:type="dxa" w:w="80"/>
               <w:left w:type="dxa" w:w="120"/>
@@ -2152,7 +2153,7 @@
                 <w:sz w:val="18"/>
                 <w:szCs w:val="18"/>
               </w:rPr>
-              <w:t xml:space="preserve">Ausente</w:t>
+              <w:t xml:space="preserve">Media jornada</w:t>
             </w:r>
           </w:p>
         </w:tc>
@@ -2182,19 +2183,22 @@
                 <w:sz w:val="18"/>
                 <w:szCs w:val="18"/>
               </w:rPr>
-              <w:t xml:space="preserve">No asistió. Se computa como inasistencia si no se justifica.</w:t>
-            </w:r>
-          </w:p>
-        </w:tc>
-        <w:tc>
-          <w:tcPr>
-            <w:tcW w:type="dxa" w:w="2500"/>
-            <w:tcBorders>
-              <w:top w:val="single" w:color="CCCCCC" w:sz="1"/>
-              <w:left w:val="single" w:color="CCCCCC" w:sz="1"/>
-              <w:bottom w:val="single" w:color="CCCCCC" w:sz="1"/>
-              <w:right w:val="single" w:color="CCCCCC" w:sz="1"/>
-            </w:tcBorders>
+              <w:t xml:space="preserve">Asistió parcialmente.</w:t>
+            </w:r>
+          </w:p>
+        </w:tc>
+      </w:tr>
+      <w:tr>
+        <w:tc>
+          <w:tcPr>
+            <w:tcW w:type="dxa" w:w="2200"/>
+            <w:tcBorders>
+              <w:top w:val="single" w:color="CCCCCC" w:sz="1"/>
+              <w:left w:val="single" w:color="CCCCCC" w:sz="1"/>
+              <w:bottom w:val="single" w:color="CCCCCC" w:sz="1"/>
+              <w:right w:val="single" w:color="CCCCCC" w:sz="1"/>
+            </w:tcBorders>
+            <w:shd w:fill="F3E5F5" w:color="auto" w:val="clear"/>
             <w:tcMar>
               <w:top w:type="dxa" w:w="80"/>
               <w:left w:type="dxa" w:w="120"/>
@@ -2212,7 +2216,37 @@
                 <w:sz w:val="18"/>
                 <w:szCs w:val="18"/>
               </w:rPr>
-              <w:t xml:space="preserve">Sí (sin justificar)</w:t>
+              <w:t xml:space="preserve">Llegada tarde / Retiro anticipado</w:t>
+            </w:r>
+          </w:p>
+        </w:tc>
+        <w:tc>
+          <w:tcPr>
+            <w:tcW w:type="dxa" w:w="4326"/>
+            <w:tcBorders>
+              <w:top w:val="single" w:color="CCCCCC" w:sz="1"/>
+              <w:left w:val="single" w:color="CCCCCC" w:sz="1"/>
+              <w:bottom w:val="single" w:color="CCCCCC" w:sz="1"/>
+              <w:right w:val="single" w:color="CCCCCC" w:sz="1"/>
+            </w:tcBorders>
+            <w:tcMar>
+              <w:top w:type="dxa" w:w="80"/>
+              <w:left w:type="dxa" w:w="120"/>
+              <w:bottom w:type="dxa" w:w="80"/>
+              <w:right w:type="dxa" w:w="120"/>
+            </w:tcMar>
+          </w:tcPr>
+          <w:p>
+            <w:r>
+              <w:rPr>
+                <w:rFonts w:ascii="Archivo" w:cs="Archivo" w:eastAsia="Archivo" w:hAnsi="Archivo"/>
+                <w:b w:val="false"/>
+                <w:bCs w:val="false"/>
+                <w:color w:val="222222"/>
+                <w:sz w:val="18"/>
+                <w:szCs w:val="18"/>
+              </w:rPr>
+              <w:t xml:space="preserve">Computa como 0,5 inasistencia.</w:t>
             </w:r>
           </w:p>
         </w:tc>
@@ -2227,7 +2261,7 @@
               <w:bottom w:val="single" w:color="CCCCCC" w:sz="1"/>
               <w:right w:val="single" w:color="CCCCCC" w:sz="1"/>
             </w:tcBorders>
-            <w:shd w:fill="FFF3E0" w:color="auto" w:val="clear"/>
+            <w:shd w:fill="F5F5F5" w:color="auto" w:val="clear"/>
             <w:tcMar>
               <w:top w:type="dxa" w:w="80"/>
               <w:left w:type="dxa" w:w="120"/>
@@ -2245,7 +2279,7 @@
                 <w:sz w:val="18"/>
                 <w:szCs w:val="18"/>
               </w:rPr>
-              <w:t xml:space="preserve">Media jornada</w:t>
+              <w:t xml:space="preserve">NC (No Corresponde)</w:t>
             </w:r>
           </w:p>
         </w:tc>
@@ -2275,223 +2309,7 @@
                 <w:sz w:val="18"/>
                 <w:szCs w:val="18"/>
               </w:rPr>
-              <w:t xml:space="preserve">Asistió parcialmente.</w:t>
-            </w:r>
-          </w:p>
-        </w:tc>
-        <w:tc>
-          <w:tcPr>
-            <w:tcW w:type="dxa" w:w="2500"/>
-            <w:tcBorders>
-              <w:top w:val="single" w:color="CCCCCC" w:sz="1"/>
-              <w:left w:val="single" w:color="CCCCCC" w:sz="1"/>
-              <w:bottom w:val="single" w:color="CCCCCC" w:sz="1"/>
-              <w:right w:val="single" w:color="CCCCCC" w:sz="1"/>
-            </w:tcBorders>
-            <w:tcMar>
-              <w:top w:type="dxa" w:w="80"/>
-              <w:left w:type="dxa" w:w="120"/>
-              <w:bottom w:type="dxa" w:w="80"/>
-              <w:right w:type="dxa" w:w="120"/>
-            </w:tcMar>
-          </w:tcPr>
-          <w:p>
-            <w:r>
-              <w:rPr>
-                <w:rFonts w:ascii="Archivo" w:cs="Archivo" w:eastAsia="Archivo" w:hAnsi="Archivo"/>
-                <w:b w:val="false"/>
-                <w:bCs w:val="false"/>
-                <w:color w:val="222222"/>
-                <w:sz w:val="18"/>
-                <w:szCs w:val="18"/>
-              </w:rPr>
-              <w:t xml:space="preserve">Media inasistencia</w:t>
-            </w:r>
-          </w:p>
-        </w:tc>
-      </w:tr>
-      <w:tr>
-        <w:tc>
-          <w:tcPr>
-            <w:tcW w:type="dxa" w:w="2200"/>
-            <w:tcBorders>
-              <w:top w:val="single" w:color="CCCCCC" w:sz="1"/>
-              <w:left w:val="single" w:color="CCCCCC" w:sz="1"/>
-              <w:bottom w:val="single" w:color="CCCCCC" w:sz="1"/>
-              <w:right w:val="single" w:color="CCCCCC" w:sz="1"/>
-            </w:tcBorders>
-            <w:shd w:fill="F3E5F5" w:color="auto" w:val="clear"/>
-            <w:tcMar>
-              <w:top w:type="dxa" w:w="80"/>
-              <w:left w:type="dxa" w:w="120"/>
-              <w:bottom w:type="dxa" w:w="80"/>
-              <w:right w:type="dxa" w:w="120"/>
-            </w:tcMar>
-          </w:tcPr>
-          <w:p>
-            <w:r>
-              <w:rPr>
-                <w:rFonts w:ascii="Archivo" w:cs="Archivo" w:eastAsia="Archivo" w:hAnsi="Archivo"/>
-                <w:b w:val="false"/>
-                <w:bCs w:val="false"/>
-                <w:color w:val="222222"/>
-                <w:sz w:val="18"/>
-                <w:szCs w:val="18"/>
-              </w:rPr>
-              <w:t xml:space="preserve">Llegada tarde / Retiro anticipado</w:t>
-            </w:r>
-          </w:p>
-        </w:tc>
-        <w:tc>
-          <w:tcPr>
-            <w:tcW w:type="dxa" w:w="4326"/>
-            <w:tcBorders>
-              <w:top w:val="single" w:color="CCCCCC" w:sz="1"/>
-              <w:left w:val="single" w:color="CCCCCC" w:sz="1"/>
-              <w:bottom w:val="single" w:color="CCCCCC" w:sz="1"/>
-              <w:right w:val="single" w:color="CCCCCC" w:sz="1"/>
-            </w:tcBorders>
-            <w:tcMar>
-              <w:top w:type="dxa" w:w="80"/>
-              <w:left w:type="dxa" w:w="120"/>
-              <w:bottom w:type="dxa" w:w="80"/>
-              <w:right w:type="dxa" w:w="120"/>
-            </w:tcMar>
-          </w:tcPr>
-          <w:p>
-            <w:r>
-              <w:rPr>
-                <w:rFonts w:ascii="Archivo" w:cs="Archivo" w:eastAsia="Archivo" w:hAnsi="Archivo"/>
-                <w:b w:val="false"/>
-                <w:bCs w:val="false"/>
-                <w:color w:val="222222"/>
-                <w:sz w:val="18"/>
-                <w:szCs w:val="18"/>
-              </w:rPr>
-              <w:t xml:space="preserve">Computa como 0,5 inasistencia.</w:t>
-            </w:r>
-          </w:p>
-        </w:tc>
-        <w:tc>
-          <w:tcPr>
-            <w:tcW w:type="dxa" w:w="2500"/>
-            <w:tcBorders>
-              <w:top w:val="single" w:color="CCCCCC" w:sz="1"/>
-              <w:left w:val="single" w:color="CCCCCC" w:sz="1"/>
-              <w:bottom w:val="single" w:color="CCCCCC" w:sz="1"/>
-              <w:right w:val="single" w:color="CCCCCC" w:sz="1"/>
-            </w:tcBorders>
-            <w:tcMar>
-              <w:top w:type="dxa" w:w="80"/>
-              <w:left w:type="dxa" w:w="120"/>
-              <w:bottom w:type="dxa" w:w="80"/>
-              <w:right w:type="dxa" w:w="120"/>
-            </w:tcMar>
-          </w:tcPr>
-          <w:p>
-            <w:r>
-              <w:rPr>
-                <w:rFonts w:ascii="Archivo" w:cs="Archivo" w:eastAsia="Archivo" w:hAnsi="Archivo"/>
-                <w:b w:val="false"/>
-                <w:bCs w:val="false"/>
-                <w:color w:val="222222"/>
-                <w:sz w:val="18"/>
-                <w:szCs w:val="18"/>
-              </w:rPr>
-              <w:t xml:space="preserve">Media inasistencia</w:t>
-            </w:r>
-          </w:p>
-        </w:tc>
-      </w:tr>
-      <w:tr>
-        <w:tc>
-          <w:tcPr>
-            <w:tcW w:type="dxa" w:w="2200"/>
-            <w:tcBorders>
-              <w:top w:val="single" w:color="CCCCCC" w:sz="1"/>
-              <w:left w:val="single" w:color="CCCCCC" w:sz="1"/>
-              <w:bottom w:val="single" w:color="CCCCCC" w:sz="1"/>
-              <w:right w:val="single" w:color="CCCCCC" w:sz="1"/>
-            </w:tcBorders>
-            <w:shd w:fill="F5F5F5" w:color="auto" w:val="clear"/>
-            <w:tcMar>
-              <w:top w:type="dxa" w:w="80"/>
-              <w:left w:type="dxa" w:w="120"/>
-              <w:bottom w:type="dxa" w:w="80"/>
-              <w:right w:type="dxa" w:w="120"/>
-            </w:tcMar>
-          </w:tcPr>
-          <w:p>
-            <w:r>
-              <w:rPr>
-                <w:rFonts w:ascii="Archivo" w:cs="Archivo" w:eastAsia="Archivo" w:hAnsi="Archivo"/>
-                <w:b w:val="false"/>
-                <w:bCs w:val="false"/>
-                <w:color w:val="222222"/>
-                <w:sz w:val="18"/>
-                <w:szCs w:val="18"/>
-              </w:rPr>
-              <w:t xml:space="preserve">NC (No Corresponde)</w:t>
-            </w:r>
-          </w:p>
-        </w:tc>
-        <w:tc>
-          <w:tcPr>
-            <w:tcW w:type="dxa" w:w="4326"/>
-            <w:tcBorders>
-              <w:top w:val="single" w:color="CCCCCC" w:sz="1"/>
-              <w:left w:val="single" w:color="CCCCCC" w:sz="1"/>
-              <w:bottom w:val="single" w:color="CCCCCC" w:sz="1"/>
-              <w:right w:val="single" w:color="CCCCCC" w:sz="1"/>
-            </w:tcBorders>
-            <w:tcMar>
-              <w:top w:type="dxa" w:w="80"/>
-              <w:left w:type="dxa" w:w="120"/>
-              <w:bottom w:type="dxa" w:w="80"/>
-              <w:right w:type="dxa" w:w="120"/>
-            </w:tcMar>
-          </w:tcPr>
-          <w:p>
-            <w:r>
-              <w:rPr>
-                <w:rFonts w:ascii="Archivo" w:cs="Archivo" w:eastAsia="Archivo" w:hAnsi="Archivo"/>
-                <w:b w:val="false"/>
-                <w:bCs w:val="false"/>
-                <w:color w:val="222222"/>
-                <w:sz w:val="18"/>
-                <w:szCs w:val="18"/>
-              </w:rPr>
               <w:t xml:space="preserve">Uso excepcional: el alumno no está alcanzado por el presentismo en esa fecha.</w:t>
-            </w:r>
-          </w:p>
-        </w:tc>
-        <w:tc>
-          <w:tcPr>
-            <w:tcW w:type="dxa" w:w="2500"/>
-            <w:tcBorders>
-              <w:top w:val="single" w:color="CCCCCC" w:sz="1"/>
-              <w:left w:val="single" w:color="CCCCCC" w:sz="1"/>
-              <w:bottom w:val="single" w:color="CCCCCC" w:sz="1"/>
-              <w:right w:val="single" w:color="CCCCCC" w:sz="1"/>
-            </w:tcBorders>
-            <w:tcMar>
-              <w:top w:type="dxa" w:w="80"/>
-              <w:left w:type="dxa" w:w="120"/>
-              <w:bottom w:type="dxa" w:w="80"/>
-              <w:right w:type="dxa" w:w="120"/>
-            </w:tcMar>
-          </w:tcPr>
-          <w:p>
-            <w:r>
-              <w:rPr>
-                <w:rFonts w:ascii="Archivo" w:cs="Archivo" w:eastAsia="Archivo" w:hAnsi="Archivo"/>
-                <w:b w:val="false"/>
-                <w:bCs w:val="false"/>
-                <w:color w:val="222222"/>
-                <w:sz w:val="18"/>
-                <w:szCs w:val="18"/>
-              </w:rPr>
-              <w:t xml:space="preserve">No computa falta</w:t>
             </w:r>
           </w:p>
         </w:tc>

</xml_diff>

<commit_message>
fix: NC solo Dirección de Área (Manual_Presentismo_Secundario_2026.docx)
</commit_message>
<xml_diff>
--- a/public/manuales/Manual_Presentismo_Secundario_2026.docx
+++ b/public/manuales/Manual_Presentismo_Secundario_2026.docx
@@ -1599,7 +1599,7 @@
                 <w:sz w:val="18"/>
                 <w:szCs w:val="18"/>
               </w:rPr>
-              <w:t xml:space="preserve">Uso excepcional: el alumno no está alcanzado por la clase en esa fecha.</w:t>
+              <w:t xml:space="preserve">Uso excepcional: el alumno no está alcanzado por la clase en esa fecha. Solo disponible para el rol Dirección de Área.</w:t>
             </w:r>
           </w:p>
         </w:tc>
@@ -2309,7 +2309,7 @@
                 <w:sz w:val="18"/>
                 <w:szCs w:val="18"/>
               </w:rPr>
-              <w:t xml:space="preserve">Uso excepcional: el alumno no está alcanzado por el presentismo en esa fecha.</w:t>
+              <w:t xml:space="preserve">Uso excepcional: el alumno no está alcanzado por el presentismo en esa fecha. Solo disponible para el rol Dirección de Área.</w:t>
             </w:r>
           </w:p>
         </w:tc>

</xml_diff>

<commit_message>
fix: justificar fuera de plazo → Dirección de Área (Manual_Presentismo_Secundario_2026.docx)
</commit_message>
<xml_diff>
--- a/public/manuales/Manual_Presentismo_Secundario_2026.docx
+++ b/public/manuales/Manual_Presentismo_Secundario_2026.docx
@@ -691,7 +691,7 @@
                 <w:sz w:val="18"/>
                 <w:szCs w:val="18"/>
               </w:rPr>
-              <w:t xml:space="preserve">Supervisa, corrige y configura situaciones. Puede justificar fuera de plazo.</w:t>
+              <w:t xml:space="preserve">Supervisa, corrige y configura situaciones.</w:t>
             </w:r>
           </w:p>
         </w:tc>
@@ -784,7 +784,7 @@
                 <w:sz w:val="18"/>
                 <w:szCs w:val="18"/>
               </w:rPr>
-              <w:t xml:space="preserve">Corrige registros bloqueados, errores de FEM, modifica regularidad manualmente</w:t>
+              <w:t xml:space="preserve">Corrige registros bloqueados, errores de FEM, modifica regularidad manualmente. Puede justificar fuera de plazo.</w:t>
             </w:r>
           </w:p>
         </w:tc>

</xml_diff>

<commit_message>
feat: sección 2.1 Habilitación días/horarios + APC espacio curricular (Manual_Presentismo_Secundario_2026.docx)
</commit_message>
<xml_diff>
--- a/public/manuales/Manual_Presentismo_Secundario_2026.docx
+++ b/public/manuales/Manual_Presentismo_Secundario_2026.docx
@@ -1019,116 +1019,111 @@
           <w:sz w:val="22"/>
           <w:szCs w:val="22"/>
         </w:rPr>
-        <w:t xml:space="preserve">2.1 Acceso</w:t>
-      </w:r>
-    </w:p>
-    <w:p>
-      <w:pPr>
-        <w:spacing w:after="60" w:before="60"/>
-        <w:ind w:left="300"/>
-      </w:pPr>
-      <w:r>
-        <w:rPr>
-          <w:rFonts w:ascii="Archivo" w:cs="Archivo" w:eastAsia="Archivo" w:hAnsi="Archivo"/>
-          <w:b/>
-          <w:bCs/>
-          <w:color w:val="073244"/>
-          <w:sz w:val="20"/>
-          <w:szCs w:val="20"/>
-        </w:rPr>
-        <w:t xml:space="preserve">1.  </w:t>
-      </w:r>
-      <w:r>
-        <w:rPr>
-          <w:rFonts w:ascii="Archivo" w:cs="Archivo" w:eastAsia="Archivo" w:hAnsi="Archivo"/>
+        <w:t xml:space="preserve">2.1 Habilitación de días y horarios</w:t>
+      </w:r>
+    </w:p>
+    <w:p>
+      <w:r>
+        <w:rPr>
+          <w:rFonts w:ascii="Archivo" w:cs="Archivo" w:eastAsia="Archivo" w:hAnsi="Archivo"/>
+          <w:b w:val="false"/>
+          <w:bCs w:val="false"/>
           <w:color w:val="222222"/>
-          <w:sz w:val="20"/>
-          <w:szCs w:val="20"/>
-        </w:rPr>
-        <w:t xml:space="preserve">Ingresar a AprendeBA con las credenciales del docente.</w:t>
-      </w:r>
-    </w:p>
-    <w:p>
-      <w:pPr>
-        <w:spacing w:after="60" w:before="60"/>
-        <w:ind w:left="300"/>
-      </w:pPr>
-      <w:r>
-        <w:rPr>
-          <w:rFonts w:ascii="Archivo" w:cs="Archivo" w:eastAsia="Archivo" w:hAnsi="Archivo"/>
-          <w:b/>
-          <w:bCs/>
-          <w:color w:val="073244"/>
-          <w:sz w:val="20"/>
-          <w:szCs w:val="20"/>
-        </w:rPr>
-        <w:t xml:space="preserve">2.  </w:t>
-      </w:r>
-      <w:r>
-        <w:rPr>
-          <w:rFonts w:ascii="Archivo" w:cs="Archivo" w:eastAsia="Archivo" w:hAnsi="Archivo"/>
+          <w:sz w:val="18"/>
+          <w:szCs w:val="18"/>
+        </w:rPr>
+        <w:t xml:space="preserve">Antes de registrar asistencia por primera vez en un espacio curricular, el docente debe habilitar los días y horarios en que dicta clases. Este paso se realiza una sola vez por espacio curricular (o cuando cambia el horario).</w:t>
+      </w:r>
+    </w:p>
+    <w:p>
+      <w:r>
+        <w:rPr>
+          <w:rFonts w:ascii="Archivo" w:cs="Archivo" w:eastAsia="Archivo" w:hAnsi="Archivo"/>
+          <w:b w:val="false"/>
+          <w:bCs w:val="false"/>
           <w:color w:val="222222"/>
-          <w:sz w:val="20"/>
-          <w:szCs w:val="20"/>
-        </w:rPr>
-        <w:t xml:space="preserve">Acceder al módulo Presentismo desde el menú lateral.</w:t>
-      </w:r>
-    </w:p>
-    <w:p>
-      <w:pPr>
-        <w:spacing w:after="60" w:before="60"/>
-        <w:ind w:left="300"/>
-      </w:pPr>
-      <w:r>
-        <w:rPr>
-          <w:rFonts w:ascii="Archivo" w:cs="Archivo" w:eastAsia="Archivo" w:hAnsi="Archivo"/>
-          <w:b/>
-          <w:bCs/>
-          <w:color w:val="073244"/>
-          <w:sz w:val="20"/>
-          <w:szCs w:val="20"/>
-        </w:rPr>
-        <w:t xml:space="preserve">3.  </w:t>
-      </w:r>
-      <w:r>
-        <w:rPr>
-          <w:rFonts w:ascii="Archivo" w:cs="Archivo" w:eastAsia="Archivo" w:hAnsi="Archivo"/>
+          <w:sz w:val="18"/>
+          <w:szCs w:val="18"/>
+        </w:rPr>
+        <w:t xml:space="preserve">1. Ingresar al espacio curricular en el módulo de Presentismo.</w:t>
+      </w:r>
+    </w:p>
+    <w:p>
+      <w:r>
+        <w:rPr>
+          <w:rFonts w:ascii="Archivo" w:cs="Archivo" w:eastAsia="Archivo" w:hAnsi="Archivo"/>
+          <w:b w:val="false"/>
+          <w:bCs w:val="false"/>
           <w:color w:val="222222"/>
-          <w:sz w:val="20"/>
-          <w:szCs w:val="20"/>
-        </w:rPr>
-        <w:t xml:space="preserve">El sistema muestra únicamente los espacios curriculares asignados al docente.</w:t>
-      </w:r>
-    </w:p>
-    <w:p>
-      <w:pPr>
-        <w:spacing w:after="60" w:before="60"/>
-        <w:ind w:left="300"/>
-      </w:pPr>
-      <w:r>
-        <w:rPr>
-          <w:rFonts w:ascii="Archivo" w:cs="Archivo" w:eastAsia="Archivo" w:hAnsi="Archivo"/>
-          <w:b/>
-          <w:bCs/>
-          <w:color w:val="073244"/>
-          <w:sz w:val="20"/>
-          <w:szCs w:val="20"/>
-        </w:rPr>
-        <w:t xml:space="preserve">4.  </w:t>
-      </w:r>
-      <w:r>
-        <w:rPr>
-          <w:rFonts w:ascii="Archivo" w:cs="Archivo" w:eastAsia="Archivo" w:hAnsi="Archivo"/>
+          <w:sz w:val="18"/>
+          <w:szCs w:val="18"/>
+        </w:rPr>
+        <w:t xml:space="preserve">2. Hacer clic en Habilitar Días.</w:t>
+      </w:r>
+    </w:p>
+    <w:p>
+      <w:r>
+        <w:rPr>
+          <w:rFonts w:ascii="Archivo" w:cs="Archivo" w:eastAsia="Archivo" w:hAnsi="Archivo"/>
+          <w:b w:val="false"/>
+          <w:bCs w:val="false"/>
           <w:color w:val="222222"/>
-          <w:sz w:val="20"/>
-          <w:szCs w:val="20"/>
-        </w:rPr>
-        <w:t xml:space="preserve">Seleccionar el espacio curricular y la fecha correspondiente.</w:t>
-      </w:r>
-    </w:p>
-    <w:p>
-      <w:r>
-        <w:t xml:space="preserve"/>
+          <w:sz w:val="18"/>
+          <w:szCs w:val="18"/>
+        </w:rPr>
+        <w:t xml:space="preserve">3. En el modal "Habilitá los días y los horarios de tus clases" completar:</w:t>
+      </w:r>
+    </w:p>
+    <w:p>
+      <w:r>
+        <w:rPr>
+          <w:rFonts w:ascii="Archivo" w:cs="Archivo" w:eastAsia="Archivo" w:hAnsi="Archivo"/>
+          <w:b w:val="false"/>
+          <w:bCs w:val="false"/>
+          <w:color w:val="222222"/>
+          <w:sz w:val="18"/>
+          <w:szCs w:val="18"/>
+        </w:rPr>
+        <w:t xml:space="preserve">   • Días: seleccionar los días en que se dicta la clase (Lunes a Viernes).</w:t>
+      </w:r>
+    </w:p>
+    <w:p>
+      <w:r>
+        <w:rPr>
+          <w:rFonts w:ascii="Archivo" w:cs="Archivo" w:eastAsia="Archivo" w:hAnsi="Archivo"/>
+          <w:b w:val="false"/>
+          <w:bCs w:val="false"/>
+          <w:color w:val="222222"/>
+          <w:sz w:val="18"/>
+          <w:szCs w:val="18"/>
+        </w:rPr>
+        <w:t xml:space="preserve">   • Horario: por cada día seleccionado, indicar el horario de inicio y fin. Se puede eliminar un día con el ícono ✕.</w:t>
+      </w:r>
+    </w:p>
+    <w:p>
+      <w:r>
+        <w:rPr>
+          <w:rFonts w:ascii="Archivo" w:cs="Archivo" w:eastAsia="Archivo" w:hAnsi="Archivo"/>
+          <w:b w:val="false"/>
+          <w:bCs w:val="false"/>
+          <w:color w:val="222222"/>
+          <w:sz w:val="18"/>
+          <w:szCs w:val="18"/>
+        </w:rPr>
+        <w:t xml:space="preserve">   • Período: definir Fecha desde y Fecha hasta del ciclo lectivo.</w:t>
+      </w:r>
+    </w:p>
+    <w:p>
+      <w:r>
+        <w:rPr>
+          <w:rFonts w:ascii="Archivo" w:cs="Archivo" w:eastAsia="Archivo" w:hAnsi="Archivo"/>
+          <w:b w:val="false"/>
+          <w:bCs w:val="false"/>
+          <w:color w:val="222222"/>
+          <w:sz w:val="18"/>
+          <w:szCs w:val="18"/>
+        </w:rPr>
+        <w:t xml:space="preserve">4. Hacer clic en Habilitar para confirmar.</w:t>
       </w:r>
     </w:p>
     <w:p>
@@ -1144,7 +1139,132 @@
           <w:sz w:val="22"/>
           <w:szCs w:val="22"/>
         </w:rPr>
-        <w:t xml:space="preserve">2.2 Estados disponibles</w:t>
+        <w:t xml:space="preserve">2.2 Acceso y registro</w:t>
+      </w:r>
+    </w:p>
+    <w:p>
+      <w:pPr>
+        <w:spacing w:after="60" w:before="60"/>
+        <w:ind w:left="300"/>
+      </w:pPr>
+      <w:r>
+        <w:rPr>
+          <w:rFonts w:ascii="Archivo" w:cs="Archivo" w:eastAsia="Archivo" w:hAnsi="Archivo"/>
+          <w:b/>
+          <w:bCs/>
+          <w:color w:val="073244"/>
+          <w:sz w:val="20"/>
+          <w:szCs w:val="20"/>
+        </w:rPr>
+        <w:t xml:space="preserve">1.  </w:t>
+      </w:r>
+      <w:r>
+        <w:rPr>
+          <w:rFonts w:ascii="Archivo" w:cs="Archivo" w:eastAsia="Archivo" w:hAnsi="Archivo"/>
+          <w:color w:val="222222"/>
+          <w:sz w:val="20"/>
+          <w:szCs w:val="20"/>
+        </w:rPr>
+        <w:t xml:space="preserve">Ingresar a AprendeBA con las credenciales del docente.</w:t>
+      </w:r>
+    </w:p>
+    <w:p>
+      <w:pPr>
+        <w:spacing w:after="60" w:before="60"/>
+        <w:ind w:left="300"/>
+      </w:pPr>
+      <w:r>
+        <w:rPr>
+          <w:rFonts w:ascii="Archivo" w:cs="Archivo" w:eastAsia="Archivo" w:hAnsi="Archivo"/>
+          <w:b/>
+          <w:bCs/>
+          <w:color w:val="073244"/>
+          <w:sz w:val="20"/>
+          <w:szCs w:val="20"/>
+        </w:rPr>
+        <w:t xml:space="preserve">2.  </w:t>
+      </w:r>
+      <w:r>
+        <w:rPr>
+          <w:rFonts w:ascii="Archivo" w:cs="Archivo" w:eastAsia="Archivo" w:hAnsi="Archivo"/>
+          <w:color w:val="222222"/>
+          <w:sz w:val="20"/>
+          <w:szCs w:val="20"/>
+        </w:rPr>
+        <w:t xml:space="preserve">Acceder al módulo Presentismo desde el menú lateral.</w:t>
+      </w:r>
+    </w:p>
+    <w:p>
+      <w:pPr>
+        <w:spacing w:after="60" w:before="60"/>
+        <w:ind w:left="300"/>
+      </w:pPr>
+      <w:r>
+        <w:rPr>
+          <w:rFonts w:ascii="Archivo" w:cs="Archivo" w:eastAsia="Archivo" w:hAnsi="Archivo"/>
+          <w:b/>
+          <w:bCs/>
+          <w:color w:val="073244"/>
+          <w:sz w:val="20"/>
+          <w:szCs w:val="20"/>
+        </w:rPr>
+        <w:t xml:space="preserve">3.  </w:t>
+      </w:r>
+      <w:r>
+        <w:rPr>
+          <w:rFonts w:ascii="Archivo" w:cs="Archivo" w:eastAsia="Archivo" w:hAnsi="Archivo"/>
+          <w:color w:val="222222"/>
+          <w:sz w:val="20"/>
+          <w:szCs w:val="20"/>
+        </w:rPr>
+        <w:t xml:space="preserve">El sistema muestra únicamente los espacios curriculares asignados al docente.</w:t>
+      </w:r>
+    </w:p>
+    <w:p>
+      <w:pPr>
+        <w:spacing w:after="60" w:before="60"/>
+        <w:ind w:left="300"/>
+      </w:pPr>
+      <w:r>
+        <w:rPr>
+          <w:rFonts w:ascii="Archivo" w:cs="Archivo" w:eastAsia="Archivo" w:hAnsi="Archivo"/>
+          <w:b/>
+          <w:bCs/>
+          <w:color w:val="073244"/>
+          <w:sz w:val="20"/>
+          <w:szCs w:val="20"/>
+        </w:rPr>
+        <w:t xml:space="preserve">4.  </w:t>
+      </w:r>
+      <w:r>
+        <w:rPr>
+          <w:rFonts w:ascii="Archivo" w:cs="Archivo" w:eastAsia="Archivo" w:hAnsi="Archivo"/>
+          <w:color w:val="222222"/>
+          <w:sz w:val="20"/>
+          <w:szCs w:val="20"/>
+        </w:rPr>
+        <w:t xml:space="preserve">Seleccionar el espacio curricular y la fecha correspondiente.</w:t>
+      </w:r>
+    </w:p>
+    <w:p>
+      <w:r>
+        <w:t xml:space="preserve"/>
+      </w:r>
+    </w:p>
+    <w:p>
+      <w:pPr>
+        <w:spacing w:after="100" w:before="220"/>
+      </w:pPr>
+      <w:r>
+        <w:rPr>
+          <w:rFonts w:ascii="Archivo" w:cs="Archivo" w:eastAsia="Archivo" w:hAnsi="Archivo"/>
+          <w:b/>
+          <w:bCs/>
+          <w:color w:val="0D6B5E"/>
+          <w:sz w:val="22"/>
+          <w:szCs w:val="22"/>
+        </w:rPr>
+        <w:t xml:space="preserve">2.3 Estados disponibles</w:t>
       </w:r>
     </w:p>
     <w:tbl>
@@ -1476,7 +1596,7 @@
                 <w:sz w:val="18"/>
                 <w:szCs w:val="18"/>
               </w:rPr>
-              <w:t xml:space="preserve">Tarde</w:t>
+              <w:t xml:space="preserve">APC (Ausente con presencia en clases)</w:t>
             </w:r>
           </w:p>
         </w:tc>
@@ -1506,7 +1626,7 @@
                 <w:sz w:val="18"/>
                 <w:szCs w:val="18"/>
               </w:rPr>
-              <w:t xml:space="preserve">El alumno llegó fuera del horario de inicio.</w:t>
+              <w:t xml:space="preserve">El alumno estuvo en el establecimiento pero no participó de la clase.</w:t>
             </w:r>
           </w:p>
         </w:tc>

</xml_diff>

<commit_message>
fix: justificación fuera de plazo → solo Dirección de Área (Manual_Presentismo_Secundario_2026.docx)
</commit_message>
<xml_diff>
--- a/public/manuales/Manual_Presentismo_Secundario_2026.docx
+++ b/public/manuales/Manual_Presentismo_Secundario_2026.docx
@@ -3191,7 +3191,7 @@
                 <w:sz w:val="18"/>
                 <w:szCs w:val="18"/>
               </w:rPr>
-              <w:t xml:space="preserve">Sí — incluso fuera del plazo estándar.</w:t>
+              <w:t xml:space="preserve">Sí — dentro del plazo habilitado para su sección.</w:t>
             </w:r>
           </w:p>
         </w:tc>
@@ -3317,7 +3317,7 @@
                 <w:sz w:val="18"/>
                 <w:szCs w:val="18"/>
               </w:rPr>
-              <w:t xml:space="preserve">Sí — para situaciones excepcionales o con período cerrado.</w:t>
+              <w:t xml:space="preserve">Sí — para situaciones excepcionales, fuera de plazo o con período cerrado.</w:t>
             </w:r>
           </w:p>
         </w:tc>
@@ -3526,7 +3526,7 @@
           <w:sz w:val="20"/>
           <w:szCs w:val="20"/>
         </w:rPr>
-        <w:t xml:space="preserve">Para períodos ya cerrados, el Directivo tiene acceso extendido. Si tampoco puede el Directivo, debe intervenir la Dirección de Área.</w:t>
+        <w:t xml:space="preserve">Para períodos ya cerrados, debe intervenir la Dirección de Área.</w:t>
       </w:r>
     </w:p>
     <w:p>
@@ -3546,7 +3546,7 @@
           <w:sz w:val="18"/>
           <w:szCs w:val="18"/>
         </w:rPr>
-        <w:t xml:space="preserve">⚠  Las inasistencias de períodos cerrados solo pueden justificarse con intervención del Directivo o la Dirección de Área.</w:t>
+        <w:t xml:space="preserve">⚠  Las inasistencias de períodos cerrados solo pueden justificarse con intervención de la Dirección de Área.</w:t>
       </w:r>
     </w:p>
     <w:p>
@@ -5799,7 +5799,7 @@
                 <w:sz w:val="18"/>
                 <w:szCs w:val="18"/>
               </w:rPr>
-              <w:t xml:space="preserve">Primera instancia para justificaciones fuera de plazo, configuración de situaciones y contraturno.</w:t>
+              <w:t xml:space="preserve">Primera instancia para configuración de situaciones y contraturno.</w:t>
             </w:r>
           </w:p>
         </w:tc>

</xml_diff>

<commit_message>
fix: 4.3 retroactiva solo Dirección de Área (Manual_Presentismo_Secundario_2026.docx)
</commit_message>
<xml_diff>
--- a/public/manuales/Manual_Presentismo_Secundario_2026.docx
+++ b/public/manuales/Manual_Presentismo_Secundario_2026.docx
@@ -3526,7 +3526,7 @@
           <w:sz w:val="20"/>
           <w:szCs w:val="20"/>
         </w:rPr>
-        <w:t xml:space="preserve">Para períodos ya cerrados, debe intervenir la Dirección de Área.</w:t>
+        <w:t xml:space="preserve">Para períodos ya cerrados, solo la Dirección de Área puede intervenir. El Directivo no tiene acceso a justificaciones retroactivas.</w:t>
       </w:r>
     </w:p>
     <w:p>
@@ -3546,7 +3546,7 @@
           <w:sz w:val="18"/>
           <w:szCs w:val="18"/>
         </w:rPr>
-        <w:t xml:space="preserve">⚠  Las inasistencias de períodos cerrados solo pueden justificarse con intervención de la Dirección de Área.</w:t>
+        <w:t xml:space="preserve">⚠  Las inasistencias de períodos cerrados solo pueden justificarse con intervención de la Dirección de Área. Ningún otro rol tiene habilitada esta acción.</w:t>
       </w:r>
     </w:p>
     <w:p>

</xml_diff>

<commit_message>
fix: Nadia — actualiza reglas de cálculo tabla 6.3 Secundario
</commit_message>
<xml_diff>
--- a/public/manuales/Manual_Presentismo_Secundario_2026.docx
+++ b/public/manuales/Manual_Presentismo_Secundario_2026.docx
@@ -5204,7 +5204,7 @@
                 <w:sz w:val="18"/>
                 <w:szCs w:val="18"/>
               </w:rPr>
-              <w:t xml:space="preserve">Inasistencias injustificadas anuales &gt; 25</w:t>
+              <w:t xml:space="preserve">Inasistencias en el bimestre (más de 5 inasistencias)</w:t>
             </w:r>
           </w:p>
         </w:tc>
@@ -5296,7 +5296,7 @@
                 <w:sz w:val="18"/>
                 <w:szCs w:val="18"/>
               </w:rPr>
-              <w:t xml:space="preserve">Inasistencias en el bimestre &gt; 15% de los días del bimestre</w:t>
+              <w:t xml:space="preserve">Inasistencias injustificadas anuales (más de 20 inasistencias)</w:t>
             </w:r>
           </w:p>
         </w:tc>
@@ -5388,7 +5388,7 @@
                 <w:sz w:val="18"/>
                 <w:szCs w:val="18"/>
               </w:rPr>
-              <w:t xml:space="preserve">Inasistencias + días sin carga &gt; 15% de los días del bimestre</w:t>
+              <w:t xml:space="preserve">Días sin carga</w:t>
             </w:r>
           </w:p>
         </w:tc>

</xml_diff>